<commit_message>
added filter by name
</commit_message>
<xml_diff>
--- a/IngSoftware/propuesta/CasosDeUso/Pedidos/1-Agregar Producto en Pedido - Copy.docx
+++ b/IngSoftware/propuesta/CasosDeUso/Pedidos/1-Agregar Producto en Pedido - Copy.docx
@@ -336,9 +336,11 @@
       <w:pPr>
         <w:pStyle w:val="Heading2"/>
       </w:pPr>
+      <w:proofErr w:type="spellStart"/>
       <w:r>
         <w:t>Precondiciones</w:t>
       </w:r>
+      <w:proofErr w:type="spellEnd"/>
     </w:p>
     <w:p>
       <w:pPr>
@@ -365,9 +367,19 @@
           <w:u w:val="single"/>
         </w:rPr>
       </w:pPr>
-      <w:r>
-        <w:t>Garantías de éxito</w:t>
-      </w:r>
+      <w:proofErr w:type="spellStart"/>
+      <w:r>
+        <w:t>Garantías</w:t>
+      </w:r>
+      <w:proofErr w:type="spellEnd"/>
+      <w:r>
+        <w:t xml:space="preserve"> de </w:t>
+      </w:r>
+      <w:proofErr w:type="spellStart"/>
+      <w:r>
+        <w:t>éxito</w:t>
+      </w:r>
+      <w:proofErr w:type="spellEnd"/>
     </w:p>
     <w:p>
       <w:pPr>
@@ -433,8 +445,13 @@
       <w:pPr>
         <w:pStyle w:val="Heading2"/>
       </w:pPr>
-      <w:r>
-        <w:t>Escenario Principal</w:t>
+      <w:proofErr w:type="spellStart"/>
+      <w:r>
+        <w:t>Escenario</w:t>
+      </w:r>
+      <w:proofErr w:type="spellEnd"/>
+      <w:r>
+        <w:t xml:space="preserve"> Principal</w:t>
       </w:r>
     </w:p>
     <w:p>
@@ -1402,6 +1419,12 @@
           <w:lang w:val="es-MX"/>
         </w:rPr>
         <w:t xml:space="preserve"> una cantidad mayor a la disponible</w:t>
+      </w:r>
+      <w:r>
+        <w:rPr>
+          <w:lang w:val="es-MX"/>
+        </w:rPr>
+        <w:t xml:space="preserve"> o con un formato erróneo.</w:t>
       </w:r>
     </w:p>
     <w:p>

</xml_diff>